<commit_message>
2026.07.23  Égi Tibi 60
Co-authored-by: Cursor <cursoragent@cursor.com>
</commit_message>
<xml_diff>
--- a/doc/Dalok listájának készítése a Github-ra.docx
+++ b/doc/Dalok listájának készítése a Github-ra.docx
@@ -296,6 +296,51 @@
       <w:pPr>
         <w:pStyle w:val="Listaszerbekezds"/>
         <w:numPr>
+          <w:ilvl w:val="1"/>
+          <w:numId w:val="2"/>
+        </w:numPr>
+      </w:pPr>
+      <w:r>
+        <w:t xml:space="preserve">Figyelem: </w:t>
+      </w:r>
+    </w:p>
+    <w:p>
+      <w:pPr>
+        <w:pStyle w:val="Listaszerbekezds"/>
+        <w:numPr>
+          <w:ilvl w:val="2"/>
+          <w:numId w:val="2"/>
+        </w:numPr>
+      </w:pPr>
+      <w:r>
+        <w:lastRenderedPageBreak/>
+        <w:t xml:space="preserve">ezt a PDF-eket ide fogja tenni: </w:t>
+      </w:r>
+      <w:hyperlink r:id="rId11" w:history="1">
+        <w:r>
+          <w:rPr>
+            <w:rStyle w:val="Hiperhivatkozs"/>
+          </w:rPr>
+          <w:t>\\wsl.localhost\Ubuntu\home\pittnerf\projects\agents\9_songtext\pdf</w:t>
+        </w:r>
+      </w:hyperlink>
+    </w:p>
+    <w:p>
+      <w:pPr>
+        <w:pStyle w:val="Listaszerbekezds"/>
+        <w:numPr>
+          <w:ilvl w:val="2"/>
+          <w:numId w:val="2"/>
+        </w:numPr>
+      </w:pPr>
+      <w:r>
+        <w:t xml:space="preserve">Innen át kell őket másolni a </w:t>
+      </w:r>
+    </w:p>
+    <w:p>
+      <w:pPr>
+        <w:pStyle w:val="Listaszerbekezds"/>
+        <w:numPr>
           <w:ilvl w:val="0"/>
           <w:numId w:val="2"/>
         </w:numPr>
@@ -312,7 +357,138 @@
           <w:numId w:val="2"/>
         </w:numPr>
       </w:pPr>
-      <w:hyperlink r:id="rId11" w:history="1">
+      <w:r>
+        <w:t>töröld ki a következő könyvtárak tartalmát:</w:t>
+      </w:r>
+    </w:p>
+    <w:p>
+      <w:pPr>
+        <w:pStyle w:val="Listaszerbekezds"/>
+        <w:numPr>
+          <w:ilvl w:val="2"/>
+          <w:numId w:val="2"/>
+        </w:numPr>
+      </w:pPr>
+      <w:hyperlink r:id="rId12" w:history="1">
+        <w:r>
+          <w:rPr>
+            <w:rStyle w:val="Hiperhivatkozs"/>
+          </w:rPr>
+          <w:t>\\wsl.localhost\Ubuntu\home\pittnerf\projects\agents\9_songtext\songs_pdfs</w:t>
+        </w:r>
+      </w:hyperlink>
+    </w:p>
+    <w:p>
+      <w:pPr>
+        <w:pStyle w:val="Listaszerbekezds"/>
+        <w:numPr>
+          <w:ilvl w:val="2"/>
+          <w:numId w:val="2"/>
+        </w:numPr>
+      </w:pPr>
+      <w:hyperlink r:id="rId13" w:history="1">
+        <w:r>
+          <w:rPr>
+            <w:rStyle w:val="Hiperhivatkozs"/>
+          </w:rPr>
+          <w:t>\\wsl.localhost\Ubuntu\home\pittnerf\projects\agents\9_songtext\public\data\images</w:t>
+        </w:r>
+      </w:hyperlink>
+    </w:p>
+    <w:p>
+      <w:pPr>
+        <w:pStyle w:val="Listaszerbekezds"/>
+        <w:numPr>
+          <w:ilvl w:val="2"/>
+          <w:numId w:val="2"/>
+        </w:numPr>
+      </w:pPr>
+      <w:r>
+        <w:t xml:space="preserve">töröld le: </w:t>
+      </w:r>
+      <w:hyperlink r:id="rId14" w:history="1">
+        <w:r>
+          <w:rPr>
+            <w:rStyle w:val="Hiperhivatkozs"/>
+          </w:rPr>
+          <w:t>\\wsl.localhost\Ubuntu\home\pittnerf\projects\agents\9_songtext\public\data\songs.json</w:t>
+        </w:r>
+      </w:hyperlink>
+      <w:r>
+        <w:t xml:space="preserve"> </w:t>
+      </w:r>
+    </w:p>
+    <w:p>
+      <w:pPr>
+        <w:pStyle w:val="Listaszerbekezds"/>
+        <w:numPr>
+          <w:ilvl w:val="1"/>
+          <w:numId w:val="2"/>
+        </w:numPr>
+      </w:pPr>
+      <w:r>
+        <w:t>Másold át a PDF-</w:t>
+      </w:r>
+      <w:proofErr w:type="gramStart"/>
+      <w:r>
+        <w:t>eket :</w:t>
+      </w:r>
+      <w:proofErr w:type="gramEnd"/>
+    </w:p>
+    <w:p>
+      <w:pPr>
+        <w:pStyle w:val="Listaszerbekezds"/>
+        <w:numPr>
+          <w:ilvl w:val="2"/>
+          <w:numId w:val="2"/>
+        </w:numPr>
+      </w:pPr>
+      <w:r>
+        <w:t xml:space="preserve">Innen: </w:t>
+      </w:r>
+      <w:hyperlink r:id="rId15" w:history="1">
+        <w:r>
+          <w:rPr>
+            <w:rStyle w:val="Hiperhivatkozs"/>
+          </w:rPr>
+          <w:t>\\wsl.localhost\Ubuntu\home\pittnerf\projects\agents\9_songtext\pdf</w:t>
+        </w:r>
+      </w:hyperlink>
+    </w:p>
+    <w:p>
+      <w:pPr>
+        <w:pStyle w:val="Listaszerbekezds"/>
+        <w:numPr>
+          <w:ilvl w:val="2"/>
+          <w:numId w:val="2"/>
+        </w:numPr>
+      </w:pPr>
+      <w:r>
+        <w:t xml:space="preserve">Ide: </w:t>
+      </w:r>
+      <w:hyperlink r:id="rId16" w:history="1">
+        <w:r>
+          <w:rPr>
+            <w:rStyle w:val="Hiperhivatkozs"/>
+          </w:rPr>
+          <w:t>\\wsl.localhost\Ubuntu\home\pittnerf\projects\agents\9_songtext\songs_pdfs</w:t>
+        </w:r>
+      </w:hyperlink>
+    </w:p>
+    <w:p>
+      <w:pPr>
+        <w:ind w:left="1980"/>
+      </w:pPr>
+    </w:p>
+    <w:p>
+      <w:pPr>
+        <w:pStyle w:val="Listaszerbekezds"/>
+        <w:numPr>
+          <w:ilvl w:val="1"/>
+          <w:numId w:val="2"/>
+        </w:numPr>
+      </w:pPr>
+      <w:hyperlink r:id="rId17" w:history="1">
         <w:r>
           <w:rPr>
             <w:rStyle w:val="Hiperhivatkozs"/>
@@ -327,10 +503,7 @@
     <w:p>
       <w:pPr>
         <w:pStyle w:val="Listaszerbekezds"/>
-        <w:numPr>
-          <w:ilvl w:val="1"/>
-          <w:numId w:val="2"/>
-        </w:numPr>
+        <w:ind w:left="1440"/>
       </w:pPr>
       <w:r>
         <w:t>python scripts/</w:t>
@@ -364,10 +537,7 @@
         <w:ind w:left="1080"/>
       </w:pPr>
       <w:r>
-        <w:t xml:space="preserve">git add </w:t>
-      </w:r>
-      <w:r>
-        <w:t xml:space="preserve">               …  amire szükség van</w:t>
+        <w:t>git add                …  amire szükség van</w:t>
       </w:r>
     </w:p>
     <w:p>
@@ -377,17 +547,19 @@
       <w:r>
         <w:t>git commit -m "2026.07.</w:t>
       </w:r>
-      <w:r>
-        <w:t>22</w:t>
-      </w:r>
-      <w:r>
-        <w:t xml:space="preserve"> v1</w:t>
-      </w:r>
-      <w:r>
-        <w:t xml:space="preserve"> Égi Tibi 60</w:t>
-      </w:r>
-      <w:r>
-        <w:t>"</w:t>
+      <w:proofErr w:type="gramStart"/>
+      <w:r>
+        <w:t>2</w:t>
+      </w:r>
+      <w:r>
+        <w:t>3</w:t>
+      </w:r>
+      <w:r>
+        <w:t xml:space="preserve">  Égi</w:t>
+      </w:r>
+      <w:proofErr w:type="gramEnd"/>
+      <w:r>
+        <w:t xml:space="preserve"> Tibi 60"</w:t>
       </w:r>
     </w:p>
     <w:p>
@@ -537,7 +709,7 @@
         <w:ind w:left="1440" w:hanging="360"/>
       </w:pPr>
     </w:lvl>
-    <w:lvl w:ilvl="2" w:tplc="040E001B" w:tentative="1">
+    <w:lvl w:ilvl="2" w:tplc="040E001B">
       <w:start w:val="1"/>
       <w:numFmt w:val="lowerRoman"/>
       <w:lvlText w:val="%3."/>
@@ -1305,6 +1477,7 @@
   <w:style w:type="character" w:default="1" w:styleId="Bekezdsalapbettpusa">
     <w:name w:val="Default Paragraph Font"/>
     <w:uiPriority w:val="1"/>
+    <w:semiHidden/>
     <w:unhideWhenUsed/>
   </w:style>
   <w:style w:type="table" w:default="1" w:styleId="Normltblzat">

</xml_diff>